<commit_message>
Reformat resume as a one-page scan
</commit_message>
<xml_diff>
--- a/docs/resume/alexander-aidun-resume.docx
+++ b/docs/resume/alexander-aidun-resume.docx
@@ -4,50 +4,50 @@
   <w:body>
     <w:p>
       <w:pPr>
-        <w:pStyle w:val="ResumeName"/>
+        <w:pStyle w:val="ResumeNameOnePage"/>
       </w:pPr>
       <w:r>
         <w:rPr>
           <w:rFonts w:ascii="Arial" w:hAnsi="Arial"/>
           <w:b/>
           <w:color w:val="14213D"/>
-          <w:sz w:val="52"/>
+          <w:sz w:val="48"/>
         </w:rPr>
         <w:t>Alexander Aidun</w:t>
       </w:r>
     </w:p>
     <w:p>
       <w:pPr>
-        <w:pStyle w:val="ResumeTitle"/>
+        <w:pStyle w:val="ResumeTitleOnePage"/>
       </w:pPr>
       <w:r>
         <w:rPr>
           <w:rFonts w:ascii="Arial" w:hAnsi="Arial"/>
           <w:b/>
           <w:color w:val="335CFF"/>
-          <w:sz w:val="25"/>
+          <w:sz w:val="22"/>
         </w:rPr>
         <w:t>Enterprise AI Product, Operations &amp; Adoption Leader</w:t>
       </w:r>
     </w:p>
     <w:p>
       <w:pPr>
-        <w:pStyle w:val="ResumeContact"/>
+        <w:pStyle w:val="ResumeContactOnePage"/>
       </w:pPr>
       <w:r>
         <w:rPr>
           <w:rFonts w:ascii="Arial" w:hAnsi="Arial"/>
           <w:color w:val="5C6878"/>
-          <w:sz w:val="18"/>
+          <w:sz w:val="16"/>
         </w:rPr>
-        <w:t xml:space="preserve">New York, NY  |  917-282-1668  |  </w:t>
+        <w:t xml:space="preserve">New York, NY | 917-282-1668 | </w:t>
       </w:r>
-      <w:hyperlink r:id="rId12">
+      <w:hyperlink r:id="rId11">
         <w:r>
           <w:rPr>
             <w:rFonts w:ascii="Arial" w:hAnsi="Arial"/>
             <w:color w:val="5C6878"/>
-            <w:sz w:val="18"/>
+            <w:sz w:val="17"/>
           </w:rPr>
           <w:t>bobuel@gmail.com</w:t>
         </w:r>
@@ -56,16 +56,16 @@
         <w:rPr>
           <w:rFonts w:ascii="Arial" w:hAnsi="Arial"/>
           <w:color w:val="5C6878"/>
-          <w:sz w:val="18"/>
+          <w:sz w:val="16"/>
         </w:rPr>
-        <w:t xml:space="preserve">  |  </w:t>
+        <w:t xml:space="preserve"> | </w:t>
       </w:r>
-      <w:hyperlink r:id="rId13">
+      <w:hyperlink r:id="rId12">
         <w:r>
           <w:rPr>
             <w:rFonts w:ascii="Arial" w:hAnsi="Arial"/>
             <w:color w:val="5C6878"/>
-            <w:sz w:val="18"/>
+            <w:sz w:val="17"/>
           </w:rPr>
           <w:t>linkedin.com/in/aaidun</w:t>
         </w:r>
@@ -74,16 +74,16 @@
         <w:rPr>
           <w:rFonts w:ascii="Arial" w:hAnsi="Arial"/>
           <w:color w:val="5C6878"/>
-          <w:sz w:val="18"/>
+          <w:sz w:val="16"/>
         </w:rPr>
-        <w:t xml:space="preserve">  |  </w:t>
+        <w:t xml:space="preserve"> | </w:t>
       </w:r>
-      <w:hyperlink r:id="rId14">
+      <w:hyperlink r:id="rId13">
         <w:r>
           <w:rPr>
             <w:rFonts w:ascii="Arial" w:hAnsi="Arial"/>
             <w:color w:val="5C6878"/>
-            <w:sz w:val="18"/>
+            <w:sz w:val="17"/>
           </w:rPr>
           <w:t>aydoon.com</w:t>
         </w:r>
@@ -92,16 +92,16 @@
         <w:rPr>
           <w:rFonts w:ascii="Arial" w:hAnsi="Arial"/>
           <w:color w:val="5C6878"/>
-          <w:sz w:val="18"/>
+          <w:sz w:val="16"/>
         </w:rPr>
-        <w:t xml:space="preserve">  |  </w:t>
+        <w:t xml:space="preserve"> | </w:t>
       </w:r>
-      <w:hyperlink r:id="rId15">
+      <w:hyperlink r:id="rId14">
         <w:r>
           <w:rPr>
             <w:rFonts w:ascii="Arial" w:hAnsi="Arial"/>
             <w:color w:val="5C6878"/>
-            <w:sz w:val="18"/>
+            <w:sz w:val="17"/>
           </w:rPr>
           <w:t>github.com/bobuel</w:t>
         </w:r>
@@ -111,7 +111,7 @@
       <w:pPr>
         <w:pStyle w:val="Heading1"/>
         <w:pBdr>
-          <w:bottom w:val="single" w:sz="6" w:space="2" w:color="DFE4DC"/>
+          <w:bottom w:val="single" w:sz="6" w:space="1" w:color="DFE4DC"/>
         </w:pBdr>
       </w:pPr>
       <w:r>
@@ -119,24 +119,29 @@
           <w:rFonts w:ascii="Arial" w:hAnsi="Arial"/>
           <w:b/>
           <w:color w:val="335CFF"/>
-          <w:sz w:val="20"/>
+          <w:sz w:val="19"/>
         </w:rPr>
-        <w:t>EXECUTIVE PROFILE</w:t>
+        <w:t>CORE</w:t>
       </w:r>
     </w:p>
     <w:p>
       <w:pPr>
-        <w:pStyle w:val="ExecutiveProfile"/>
+        <w:pStyle w:val="CoreLineOnePage"/>
       </w:pPr>
       <w:r>
-        <w:t>Enterprise AI product and adoption leader who designs the operating systems around AI: functional and cost operations, internal products, agentic workflows, learning, evaluation, and peer enablement. Currently helps operate a 1,500-employee AI environment at Automattic; previously led four AI initiatives at Dremio and scaled Dremio University to 3,200+ users with +78 NPS. Hands-on builder who translates emerging model capability into useful, repeatable work.</w:t>
+        <w:rPr>
+          <w:rFonts w:ascii="Arial" w:hAnsi="Arial"/>
+          <w:color w:val="14213D"/>
+          <w:sz w:val="17"/>
+        </w:rPr>
+        <w:t>AI operations | AI product strategy | Systems design | Agentic workflows | Adoption | Enablement | Executive advisory | Prototyping</w:t>
       </w:r>
     </w:p>
     <w:p>
       <w:pPr>
         <w:pStyle w:val="Heading1"/>
         <w:pBdr>
-          <w:bottom w:val="single" w:sz="6" w:space="2" w:color="DFE4DC"/>
+          <w:bottom w:val="single" w:sz="6" w:space="1" w:color="DFE4DC"/>
         </w:pBdr>
       </w:pPr>
       <w:r>
@@ -144,65 +149,31 @@
           <w:rFonts w:ascii="Arial" w:hAnsi="Arial"/>
           <w:b/>
           <w:color w:val="335CFF"/>
-          <w:sz w:val="20"/>
+          <w:sz w:val="19"/>
         </w:rPr>
-        <w:t>CORE CAPABILITIES</w:t>
+        <w:t>EXPERIENCE</w:t>
       </w:r>
     </w:p>
     <w:p>
       <w:pPr>
-        <w:pStyle w:val="CompactLine"/>
-      </w:pPr>
-      <w:r>
-        <w:t>Enterprise AI operations | AI product strategy | Agentic workflows | Systems design | AI adoption and behavior change | Product discovery | Learning and enablement | Executive AI advisory | Cross-functional leadership | Hands-on prototyping</w:t>
-      </w:r>
-    </w:p>
-    <w:p>
-      <w:pPr>
-        <w:pStyle w:val="CompactLine"/>
+        <w:pStyle w:val="JobHeaderOnePage"/>
       </w:pPr>
       <w:r>
         <w:rPr>
           <w:rFonts w:ascii="Arial" w:hAnsi="Arial"/>
           <w:b/>
           <w:color w:val="14213D"/>
-          <w:sz w:val="18"/>
+          <w:sz w:val="17"/>
         </w:rPr>
-        <w:t xml:space="preserve">Platforms and methods: </w:t>
+        <w:t>AUTOMATTIC</w:t>
       </w:r>
-      <w:r>
-        <w:t>ChatGPT, Claude, Codex, Claude Code, Cowork, MCP, Zapier, OpenAI, GitHub, Jira, and Pendo</w:t>
-      </w:r>
-    </w:p>
-    <w:p>
-      <w:pPr>
-        <w:pStyle w:val="Heading1"/>
-        <w:pBdr>
-          <w:bottom w:val="single" w:sz="6" w:space="2" w:color="DFE4DC"/>
-        </w:pBdr>
-      </w:pPr>
       <w:r>
         <w:rPr>
           <w:rFonts w:ascii="Arial" w:hAnsi="Arial"/>
-          <w:b/>
-          <w:color w:val="335CFF"/>
-          <w:sz w:val="20"/>
+          <w:color w:val="5C6878"/>
+          <w:sz w:val="17"/>
         </w:rPr>
-        <w:t>PROFESSIONAL EXPERIENCE</w:t>
-      </w:r>
-    </w:p>
-    <w:p>
-      <w:pPr>
-        <w:pStyle w:val="JobHeader"/>
-      </w:pPr>
-      <w:r>
-        <w:rPr>
-          <w:rFonts w:ascii="Arial" w:hAnsi="Arial"/>
-          <w:b/>
-          <w:color w:val="14213D"/>
-          <w:sz w:val="19"/>
-        </w:rPr>
-        <w:t>AUTOMATTIC</w:t>
+        <w:t xml:space="preserve"> | AI Adoption Manager</w:t>
       </w:r>
       <w:r>
         <w:tab/>
@@ -212,113 +183,97 @@
           <w:rFonts w:ascii="Arial" w:hAnsi="Arial"/>
           <w:b/>
           <w:color w:val="5C6878"/>
-          <w:sz w:val="17"/>
+          <w:sz w:val="16"/>
         </w:rPr>
-        <w:t>March 2026 - Present</w:t>
+        <w:t>Mar 2026 - Present</w:t>
       </w:r>
     </w:p>
     <w:p>
       <w:pPr>
-        <w:pStyle w:val="RoleLine"/>
+        <w:pStyle w:val="ImpactLineOnePage"/>
       </w:pPr>
       <w:r>
         <w:rPr>
           <w:rFonts w:ascii="Arial" w:hAnsi="Arial"/>
-          <w:i/>
-          <w:color w:val="5C6878"/>
+          <w:b/>
+          <w:color w:val="335CFF"/>
           <w:sz w:val="18"/>
         </w:rPr>
-        <w:t>AI Adoption Manager</w:t>
+        <w:t xml:space="preserve">OPERATE  </w:t>
       </w:r>
-      <w:r>
-        <w:rPr>
-          <w:rFonts w:ascii="Arial" w:hAnsi="Arial"/>
-          <w:color w:val="5C6878"/>
-          <w:sz w:val="18"/>
-        </w:rPr>
-        <w:t xml:space="preserve"> | New York</w:t>
-      </w:r>
-    </w:p>
-    <w:p>
-      <w:pPr>
-        <w:pStyle w:val="ResumeBullet"/>
-        <w:numPr>
-          <w:ilvl w:val="0"/>
-          <w:numId w:val="10"/>
-        </w:numPr>
-      </w:pPr>
       <w:r>
         <w:rPr>
           <w:rFonts w:ascii="Arial" w:hAnsi="Arial"/>
           <w:color w:val="14213D"/>
           <w:sz w:val="18"/>
         </w:rPr>
-        <w:t>Help administer and operate ChatGPT (including Codex and Work) and Claude (including Cowork and Code) for 1,500 employees, with functional and cost responsibilities across the environment.</w:t>
+        <w:t>ChatGPT and Claude for 1,500 employees, including functional and cost operations.</w:t>
       </w:r>
     </w:p>
     <w:p>
       <w:pPr>
-        <w:pStyle w:val="ResumeBullet"/>
-        <w:numPr>
-          <w:ilvl w:val="0"/>
-          <w:numId w:val="10"/>
-        </w:numPr>
+        <w:pStyle w:val="ImpactLineOnePage"/>
       </w:pPr>
+      <w:r>
+        <w:rPr>
+          <w:rFonts w:ascii="Arial" w:hAnsi="Arial"/>
+          <w:b/>
+          <w:color w:val="335CFF"/>
+          <w:sz w:val="18"/>
+        </w:rPr>
+        <w:t xml:space="preserve">OWN  </w:t>
+      </w:r>
       <w:r>
         <w:rPr>
           <w:rFonts w:ascii="Arial" w:hAnsi="Arial"/>
           <w:color w:val="14213D"/>
           <w:sz w:val="18"/>
         </w:rPr>
-        <w:t>Own product management for an internal AI Agent, AI Learning, LibreChat, and Slack-based agentic automations, connecting operations, workflows, guidance, and adoption.</w:t>
+        <w:t>AI Agent, AI Learning, LibreChat, and Slack automations across product, guidance, and adoption.</w:t>
       </w:r>
     </w:p>
     <w:p>
       <w:pPr>
-        <w:pStyle w:val="ResumeBullet"/>
-        <w:numPr>
-          <w:ilvl w:val="0"/>
-          <w:numId w:val="10"/>
-        </w:numPr>
+        <w:pStyle w:val="ImpactLineOnePage"/>
       </w:pPr>
+      <w:r>
+        <w:rPr>
+          <w:rFonts w:ascii="Arial" w:hAnsi="Arial"/>
+          <w:b/>
+          <w:color w:val="335CFF"/>
+          <w:sz w:val="18"/>
+        </w:rPr>
+        <w:t xml:space="preserve">ENABLE  </w:t>
+      </w:r>
       <w:r>
         <w:rPr>
           <w:rFonts w:ascii="Arial" w:hAnsi="Arial"/>
           <w:color w:val="14213D"/>
           <w:sz w:val="18"/>
         </w:rPr>
-        <w:t>Design and deliver immersive enablement and publish 2-3 practical how-to articles per week to translate platform capability into repeatable work.</w:t>
+        <w:t>Publish 2-3 how-to articles weekly, lead AI Guides, and scope executive AI use cases.</w:t>
       </w:r>
     </w:p>
     <w:p>
       <w:pPr>
-        <w:pStyle w:val="ResumeBullet"/>
-        <w:numPr>
-          <w:ilvl w:val="0"/>
-          <w:numId w:val="10"/>
-        </w:numPr>
-      </w:pPr>
-      <w:r>
-        <w:rPr>
-          <w:rFonts w:ascii="Arial" w:hAnsi="Arial"/>
-          <w:color w:val="14213D"/>
-          <w:sz w:val="18"/>
-        </w:rPr>
-        <w:t>Lead the AI Guides champion program and scope executive AI use cases as a personal AI product manager for C-suite leaders.</w:t>
-      </w:r>
-    </w:p>
-    <w:p>
-      <w:pPr>
-        <w:pStyle w:val="JobHeader"/>
+        <w:pStyle w:val="JobHeaderOnePage"/>
       </w:pPr>
       <w:r>
         <w:rPr>
           <w:rFonts w:ascii="Arial" w:hAnsi="Arial"/>
           <w:b/>
           <w:color w:val="14213D"/>
-          <w:sz w:val="19"/>
+          <w:sz w:val="17"/>
         </w:rPr>
         <w:t>DREMIO</w:t>
+      </w:r>
+      <w:r>
+        <w:rPr>
+          <w:rFonts w:ascii="Arial" w:hAnsi="Arial"/>
+          <w:color w:val="5C6878"/>
+          <w:sz w:val="17"/>
+        </w:rPr>
+        <w:t xml:space="preserve"> | Senior AI PM + Director, Education &amp; Documentation</w:t>
       </w:r>
       <w:r>
         <w:tab/>
@@ -328,113 +283,119 @@
           <w:rFonts w:ascii="Arial" w:hAnsi="Arial"/>
           <w:b/>
           <w:color w:val="5C6878"/>
-          <w:sz w:val="17"/>
+          <w:sz w:val="16"/>
         </w:rPr>
-        <w:t>January 2024 - March 2026</w:t>
+        <w:t>Jan 2024 - Mar 2026</w:t>
       </w:r>
     </w:p>
     <w:p>
       <w:pPr>
-        <w:pStyle w:val="RoleLine"/>
+        <w:pStyle w:val="ImpactLineOnePage"/>
       </w:pPr>
       <w:r>
         <w:rPr>
           <w:rFonts w:ascii="Arial" w:hAnsi="Arial"/>
-          <w:i/>
-          <w:color w:val="5C6878"/>
+          <w:b/>
+          <w:color w:val="335CFF"/>
           <w:sz w:val="18"/>
         </w:rPr>
-        <w:t>Senior AI Product Manager and Director, Education &amp; Documentation</w:t>
+        <w:t xml:space="preserve">LEAD  </w:t>
       </w:r>
-      <w:r>
-        <w:rPr>
-          <w:rFonts w:ascii="Arial" w:hAnsi="Arial"/>
-          <w:color w:val="5C6878"/>
-          <w:sz w:val="18"/>
-        </w:rPr>
-        <w:t xml:space="preserve"> | Remote</w:t>
-      </w:r>
-    </w:p>
-    <w:p>
-      <w:pPr>
-        <w:pStyle w:val="ResumeBullet"/>
-        <w:numPr>
-          <w:ilvl w:val="0"/>
-          <w:numId w:val="10"/>
-        </w:numPr>
-      </w:pPr>
       <w:r>
         <w:rPr>
           <w:rFonts w:ascii="Arial" w:hAnsi="Arial"/>
           <w:color w:val="14213D"/>
           <w:sz w:val="18"/>
         </w:rPr>
-        <w:t>Led a four-initiative AI portfolio spanning an AI Agent, MCP Server, AI SQL Functions, and a Data Analyst chatbot; translated customer discovery into roadmap and workflow decisions.</w:t>
+        <w:t>Four AI initiatives: AI Agent, MCP Server, AI SQL Functions, and Data Analyst chatbot.</w:t>
       </w:r>
     </w:p>
     <w:p>
       <w:pPr>
-        <w:pStyle w:val="ResumeBullet"/>
-        <w:numPr>
-          <w:ilvl w:val="0"/>
-          <w:numId w:val="10"/>
-        </w:numPr>
+        <w:pStyle w:val="ImpactLineOnePage"/>
       </w:pPr>
+      <w:r>
+        <w:rPr>
+          <w:rFonts w:ascii="Arial" w:hAnsi="Arial"/>
+          <w:b/>
+          <w:color w:val="335CFF"/>
+          <w:sz w:val="18"/>
+        </w:rPr>
+        <w:t xml:space="preserve">DISCOVER  </w:t>
+      </w:r>
       <w:r>
         <w:rPr>
           <w:rFonts w:ascii="Arial" w:hAnsi="Arial"/>
           <w:color w:val="14213D"/>
           <w:sz w:val="18"/>
         </w:rPr>
-        <w:t>Partnered with Design and Engineering to prioritize use cases, product experience, and revenue potential across the portfolio.</w:t>
+        <w:t>Converted customer research into roadmap priorities with Design and Engineering.</w:t>
       </w:r>
     </w:p>
     <w:p>
       <w:pPr>
-        <w:pStyle w:val="ResumeBullet"/>
-        <w:numPr>
-          <w:ilvl w:val="0"/>
-          <w:numId w:val="10"/>
-        </w:numPr>
+        <w:pStyle w:val="ImpactLineOnePage"/>
       </w:pPr>
+      <w:r>
+        <w:rPr>
+          <w:rFonts w:ascii="Arial" w:hAnsi="Arial"/>
+          <w:b/>
+          <w:color w:val="335CFF"/>
+          <w:sz w:val="18"/>
+        </w:rPr>
+        <w:t xml:space="preserve">AUTOMATE  </w:t>
+      </w:r>
       <w:r>
         <w:rPr>
           <w:rFonts w:ascii="Arial" w:hAnsi="Arial"/>
           <w:color w:val="14213D"/>
           <w:sz w:val="18"/>
         </w:rPr>
-        <w:t>Owned the Documentation and Dremio University teams while driving cross-functional AI automation with Zapier, OpenAI, Jira, GitHub, and MCP.</w:t>
+        <w:t>Owned Documentation and DremioU; built automation with Zapier, OpenAI, Jira, GitHub, and MCP.</w:t>
       </w:r>
     </w:p>
     <w:p>
       <w:pPr>
-        <w:pStyle w:val="ResumeBullet"/>
-        <w:numPr>
-          <w:ilvl w:val="0"/>
-          <w:numId w:val="10"/>
-        </w:numPr>
+        <w:pStyle w:val="ImpactLineOnePage"/>
       </w:pPr>
+      <w:r>
+        <w:rPr>
+          <w:rFonts w:ascii="Arial" w:hAnsi="Arial"/>
+          <w:b/>
+          <w:color w:val="335CFF"/>
+          <w:sz w:val="18"/>
+        </w:rPr>
+        <w:t xml:space="preserve">SCALE  </w:t>
+      </w:r>
       <w:r>
         <w:rPr>
           <w:rFonts w:ascii="Arial" w:hAnsi="Arial"/>
           <w:color w:val="14213D"/>
           <w:sz w:val="18"/>
         </w:rPr>
-        <w:t>Separately, scaled Dremio University to 3,200+ users, 1,000+ badges, +78 NPS, and a 50% course completion rate within six months.</w:t>
+        <w:t>Separately grew DremioU to 3,200+ users, 1,000+ badges, +78 NPS, and 50% completion.</w:t>
       </w:r>
     </w:p>
     <w:p>
       <w:pPr>
-        <w:pStyle w:val="JobHeader"/>
+        <w:pStyle w:val="JobHeaderOnePage"/>
       </w:pPr>
       <w:r>
         <w:rPr>
           <w:rFonts w:ascii="Arial" w:hAnsi="Arial"/>
           <w:b/>
           <w:color w:val="14213D"/>
-          <w:sz w:val="19"/>
+          <w:sz w:val="17"/>
         </w:rPr>
         <w:t>BRAZE</w:t>
+      </w:r>
+      <w:r>
+        <w:rPr>
+          <w:rFonts w:ascii="Arial" w:hAnsi="Arial"/>
+          <w:color w:val="5C6878"/>
+          <w:sz w:val="17"/>
+        </w:rPr>
+        <w:t xml:space="preserve"> | Senior Manager, Partner Education</w:t>
       </w:r>
       <w:r>
         <w:tab/>
@@ -444,96 +405,53 @@
           <w:rFonts w:ascii="Arial" w:hAnsi="Arial"/>
           <w:b/>
           <w:color w:val="5C6878"/>
-          <w:sz w:val="17"/>
+          <w:sz w:val="16"/>
         </w:rPr>
-        <w:t>November 2022 - January 2024</w:t>
+        <w:t>Nov 2022 - Jan 2024</w:t>
       </w:r>
     </w:p>
     <w:p>
       <w:pPr>
-        <w:pStyle w:val="RoleLine"/>
+        <w:pStyle w:val="ImpactLineOnePage"/>
       </w:pPr>
       <w:r>
         <w:rPr>
           <w:rFonts w:ascii="Arial" w:hAnsi="Arial"/>
-          <w:i/>
-          <w:color w:val="5C6878"/>
+          <w:b/>
+          <w:color w:val="335CFF"/>
           <w:sz w:val="18"/>
         </w:rPr>
-        <w:t>Senior Manager, Partner Education</w:t>
+        <w:t xml:space="preserve">MODERNIZE  </w:t>
       </w:r>
-      <w:r>
-        <w:rPr>
-          <w:rFonts w:ascii="Arial" w:hAnsi="Arial"/>
-          <w:color w:val="5C6878"/>
-          <w:sz w:val="18"/>
-        </w:rPr>
-        <w:t xml:space="preserve"> | Remote</w:t>
-      </w:r>
-    </w:p>
-    <w:p>
-      <w:pPr>
-        <w:pStyle w:val="ResumeBullet"/>
-        <w:numPr>
-          <w:ilvl w:val="0"/>
-          <w:numId w:val="10"/>
-        </w:numPr>
-      </w:pPr>
       <w:r>
         <w:rPr>
           <w:rFonts w:ascii="Arial" w:hAnsi="Arial"/>
           <w:color w:val="14213D"/>
           <w:sz w:val="18"/>
         </w:rPr>
-        <w:t>Led global partner education strategy, staffing, and programming across small, medium, and global strategic partners, including Accenture and Deloitte.</w:t>
+        <w:t>Led global partner education; used generative AI to replace live mock testing and speed content.</w:t>
       </w:r>
     </w:p>
     <w:p>
       <w:pPr>
-        <w:pStyle w:val="ResumeBullet"/>
-        <w:numPr>
-          <w:ilvl w:val="0"/>
-          <w:numId w:val="10"/>
-        </w:numPr>
-      </w:pPr>
-      <w:r>
-        <w:rPr>
-          <w:rFonts w:ascii="Arial" w:hAnsi="Arial"/>
-          <w:color w:val="14213D"/>
-          <w:sz w:val="18"/>
-        </w:rPr>
-        <w:t>Introduced generative AI and prompt engineering to replace live mock-session testing and accelerate content development.</w:t>
-      </w:r>
-    </w:p>
-    <w:p>
-      <w:pPr>
-        <w:pStyle w:val="Heading1"/>
-        <w:pBdr>
-          <w:bottom w:val="single" w:sz="6" w:space="2" w:color="DFE4DC"/>
-        </w:pBdr>
-      </w:pPr>
-      <w:r>
-        <w:rPr>
-          <w:rFonts w:ascii="Arial" w:hAnsi="Arial"/>
-          <w:b/>
-          <w:color w:val="335CFF"/>
-          <w:sz w:val="20"/>
-        </w:rPr>
-        <w:t>EARLIER LEADERSHIP EXPERIENCE</w:t>
-      </w:r>
-    </w:p>
-    <w:p>
-      <w:pPr>
-        <w:pStyle w:val="JobHeader"/>
+        <w:pStyle w:val="JobHeaderOnePage"/>
       </w:pPr>
       <w:r>
         <w:rPr>
           <w:rFonts w:ascii="Arial" w:hAnsi="Arial"/>
           <w:b/>
           <w:color w:val="14213D"/>
-          <w:sz w:val="19"/>
+          <w:sz w:val="17"/>
         </w:rPr>
         <w:t>ARRIKTO</w:t>
+      </w:r>
+      <w:r>
+        <w:rPr>
+          <w:rFonts w:ascii="Arial" w:hAnsi="Arial"/>
+          <w:color w:val="5C6878"/>
+          <w:sz w:val="17"/>
+        </w:rPr>
+        <w:t xml:space="preserve"> | Global Director, Education</w:t>
       </w:r>
       <w:r>
         <w:tab/>
@@ -543,84 +461,53 @@
           <w:rFonts w:ascii="Arial" w:hAnsi="Arial"/>
           <w:b/>
           <w:color w:val="5C6878"/>
-          <w:sz w:val="17"/>
+          <w:sz w:val="16"/>
         </w:rPr>
-        <w:t>September 2021 - August 2022</w:t>
+        <w:t>Sep 2021 - Aug 2022</w:t>
       </w:r>
     </w:p>
     <w:p>
       <w:pPr>
-        <w:pStyle w:val="RoleLine"/>
+        <w:pStyle w:val="ImpactLineOnePage"/>
       </w:pPr>
       <w:r>
         <w:rPr>
           <w:rFonts w:ascii="Arial" w:hAnsi="Arial"/>
-          <w:i/>
-          <w:color w:val="5C6878"/>
+          <w:b/>
+          <w:color w:val="335CFF"/>
           <w:sz w:val="18"/>
         </w:rPr>
-        <w:t>Global Director, Education</w:t>
+        <w:t xml:space="preserve">GROW  </w:t>
       </w:r>
-      <w:r>
-        <w:rPr>
-          <w:rFonts w:ascii="Arial" w:hAnsi="Arial"/>
-          <w:color w:val="5C6878"/>
-          <w:sz w:val="18"/>
-        </w:rPr>
-        <w:t xml:space="preserve"> | Remote</w:t>
-      </w:r>
-    </w:p>
-    <w:p>
-      <w:pPr>
-        <w:pStyle w:val="ResumeBullet"/>
-        <w:numPr>
-          <w:ilvl w:val="0"/>
-          <w:numId w:val="10"/>
-        </w:numPr>
-      </w:pPr>
       <w:r>
         <w:rPr>
           <w:rFonts w:ascii="Arial" w:hAnsi="Arial"/>
           <w:color w:val="14213D"/>
           <w:sz w:val="18"/>
         </w:rPr>
-        <w:t>Owned global customer and employee education strategy, staffing, and delivery for a data science and MLOps startup.</w:t>
+        <w:t>Reached 32% weekly course completion, 750+ registrants, and 1,400 enrollments in six months.</w:t>
       </w:r>
     </w:p>
     <w:p>
       <w:pPr>
-        <w:pStyle w:val="ResumeBullet"/>
-        <w:numPr>
-          <w:ilvl w:val="0"/>
-          <w:numId w:val="10"/>
-        </w:numPr>
-      </w:pPr>
-      <w:r>
-        <w:rPr>
-          <w:rFonts w:ascii="Arial" w:hAnsi="Arial"/>
-          <w:color w:val="14213D"/>
-          <w:sz w:val="18"/>
-        </w:rPr>
-        <w:t>Reached a 32% weekly course completion rate in six months, with more than 750 registrants and 1,400 enrollments.</w:t>
-      </w:r>
-    </w:p>
-    <w:p>
-      <w:r>
-        <w:br w:type="page"/>
-      </w:r>
-    </w:p>
-    <w:p>
-      <w:pPr>
-        <w:pStyle w:val="JobHeader"/>
+        <w:pStyle w:val="JobHeaderOnePage"/>
       </w:pPr>
       <w:r>
         <w:rPr>
           <w:rFonts w:ascii="Arial" w:hAnsi="Arial"/>
           <w:b/>
           <w:color w:val="14213D"/>
-          <w:sz w:val="19"/>
+          <w:sz w:val="17"/>
         </w:rPr>
         <w:t>WORKFUSION</w:t>
+      </w:r>
+      <w:r>
+        <w:rPr>
+          <w:rFonts w:ascii="Arial" w:hAnsi="Arial"/>
+          <w:color w:val="5C6878"/>
+          <w:sz w:val="17"/>
+        </w:rPr>
+        <w:t xml:space="preserve"> | Director, Product Enablement / Education / Documentation</w:t>
       </w:r>
       <w:r>
         <w:tab/>
@@ -630,79 +517,53 @@
           <w:rFonts w:ascii="Arial" w:hAnsi="Arial"/>
           <w:b/>
           <w:color w:val="5C6878"/>
-          <w:sz w:val="17"/>
+          <w:sz w:val="16"/>
         </w:rPr>
-        <w:t>January 2021 - August 2021</w:t>
+        <w:t>Jan 2021 - Aug 2021</w:t>
       </w:r>
     </w:p>
     <w:p>
       <w:pPr>
-        <w:pStyle w:val="RoleLine"/>
+        <w:pStyle w:val="ImpactLineOnePage"/>
       </w:pPr>
       <w:r>
         <w:rPr>
           <w:rFonts w:ascii="Arial" w:hAnsi="Arial"/>
-          <w:i/>
-          <w:color w:val="5C6878"/>
+          <w:b/>
+          <w:color w:val="335CFF"/>
           <w:sz w:val="18"/>
         </w:rPr>
-        <w:t>Director, Product Enablement, Education &amp; Documentation</w:t>
+        <w:t xml:space="preserve">ALIGN  </w:t>
       </w:r>
-      <w:r>
-        <w:rPr>
-          <w:rFonts w:ascii="Arial" w:hAnsi="Arial"/>
-          <w:color w:val="5C6878"/>
-          <w:sz w:val="18"/>
-        </w:rPr>
-        <w:t xml:space="preserve"> | New York, NY</w:t>
-      </w:r>
-    </w:p>
-    <w:p>
-      <w:pPr>
-        <w:pStyle w:val="ResumeBullet"/>
-        <w:numPr>
-          <w:ilvl w:val="0"/>
-          <w:numId w:val="10"/>
-        </w:numPr>
-      </w:pPr>
       <w:r>
         <w:rPr>
           <w:rFonts w:ascii="Arial" w:hAnsi="Arial"/>
           <w:color w:val="14213D"/>
           <w:sz w:val="18"/>
         </w:rPr>
-        <w:t>Led distributed Documentation, Education, and Enablement functions across the United States, Belarus, Poland, and India, managing managers, writers, developers, and enablement staff.</w:t>
+        <w:t>Led distributed Documentation, Education, and Enablement teams across the US, Europe, and India.</w:t>
       </w:r>
     </w:p>
     <w:p>
       <w:pPr>
-        <w:pStyle w:val="ResumeBullet"/>
-        <w:numPr>
-          <w:ilvl w:val="0"/>
-          <w:numId w:val="10"/>
-        </w:numPr>
-      </w:pPr>
-      <w:r>
-        <w:rPr>
-          <w:rFonts w:ascii="Arial" w:hAnsi="Arial"/>
-          <w:color w:val="14213D"/>
-          <w:sz w:val="18"/>
-        </w:rPr>
-        <w:t>Connected product functionality to technical documentation, self-service hands-on learning, and coordinated enablement across a global operating model.</w:t>
-      </w:r>
-    </w:p>
-    <w:p>
-      <w:pPr>
-        <w:pStyle w:val="JobHeader"/>
+        <w:pStyle w:val="JobHeaderOnePage"/>
       </w:pPr>
       <w:r>
         <w:rPr>
           <w:rFonts w:ascii="Arial" w:hAnsi="Arial"/>
           <w:b/>
           <w:color w:val="14213D"/>
-          <w:sz w:val="19"/>
+          <w:sz w:val="17"/>
         </w:rPr>
         <w:t>QUBOLE</w:t>
+      </w:r>
+      <w:r>
+        <w:rPr>
+          <w:rFonts w:ascii="Arial" w:hAnsi="Arial"/>
+          <w:color w:val="5C6878"/>
+          <w:sz w:val="17"/>
+        </w:rPr>
+        <w:t xml:space="preserve"> | Global Director, Education Services &amp; Technical Publications</w:t>
       </w:r>
       <w:r>
         <w:tab/>
@@ -712,89 +573,82 @@
           <w:rFonts w:ascii="Arial" w:hAnsi="Arial"/>
           <w:b/>
           <w:color w:val="5C6878"/>
-          <w:sz w:val="17"/>
+          <w:sz w:val="16"/>
         </w:rPr>
-        <w:t>December 2015 - December 2020</w:t>
+        <w:t>Dec 2015 - Dec 2020</w:t>
       </w:r>
     </w:p>
     <w:p>
       <w:pPr>
-        <w:pStyle w:val="RoleLine"/>
+        <w:pStyle w:val="ImpactLineOnePage"/>
       </w:pPr>
       <w:r>
         <w:rPr>
           <w:rFonts w:ascii="Arial" w:hAnsi="Arial"/>
-          <w:i/>
-          <w:color w:val="5C6878"/>
+          <w:b/>
+          <w:color w:val="335CFF"/>
           <w:sz w:val="18"/>
         </w:rPr>
-        <w:t>Global Director, Education Services &amp; Technical Publications (2020); Global Director, Education Services (2015 - 2020)</w:t>
+        <w:t xml:space="preserve">BUILD  </w:t>
       </w:r>
-      <w:r>
-        <w:rPr>
-          <w:rFonts w:ascii="Arial" w:hAnsi="Arial"/>
-          <w:color w:val="5C6878"/>
-          <w:sz w:val="18"/>
-        </w:rPr>
-        <w:t xml:space="preserve"> | New York, NY</w:t>
-      </w:r>
-    </w:p>
-    <w:p>
-      <w:pPr>
-        <w:pStyle w:val="ResumeBullet"/>
-        <w:numPr>
-          <w:ilvl w:val="0"/>
-          <w:numId w:val="10"/>
-        </w:numPr>
-      </w:pPr>
       <w:r>
         <w:rPr>
           <w:rFonts w:ascii="Arial" w:hAnsi="Arial"/>
           <w:color w:val="14213D"/>
           <w:sz w:val="18"/>
         </w:rPr>
-        <w:t>Owned external customer education, employee technical onboarding, partner enablement and certification, and technical publications.</w:t>
+        <w:t>Owned customer education, technical onboarding, partner certification, and technical publications.</w:t>
       </w:r>
     </w:p>
     <w:p>
       <w:pPr>
-        <w:pStyle w:val="ResumeBullet"/>
-        <w:numPr>
-          <w:ilvl w:val="0"/>
-          <w:numId w:val="10"/>
-        </w:numPr>
+        <w:pStyle w:val="ImpactLineOnePage"/>
       </w:pPr>
+      <w:r>
+        <w:rPr>
+          <w:rFonts w:ascii="Arial" w:hAnsi="Arial"/>
+          <w:b/>
+          <w:color w:val="335CFF"/>
+          <w:sz w:val="18"/>
+        </w:rPr>
+        <w:t xml:space="preserve">MONETIZE  </w:t>
+      </w:r>
       <w:r>
         <w:rPr>
           <w:rFonts w:ascii="Arial" w:hAnsi="Arial"/>
           <w:color w:val="14213D"/>
           <w:sz w:val="18"/>
         </w:rPr>
-        <w:t>Developed paid education services packages, including a largest engagement of $300K, and led a media producer, designer, and eight course developers.</w:t>
+        <w:t>Built education packages up to $300K; led a 10-person team; implemented Pendo onboarding and telemetry.</w:t>
       </w:r>
     </w:p>
     <w:p>
       <w:pPr>
-        <w:pStyle w:val="ResumeBullet"/>
-        <w:numPr>
-          <w:ilvl w:val="0"/>
-          <w:numId w:val="10"/>
-        </w:numPr>
+        <w:pStyle w:val="JobHeaderOnePage"/>
       </w:pPr>
       <w:r>
         <w:rPr>
           <w:rFonts w:ascii="Arial" w:hAnsi="Arial"/>
+          <w:b/>
           <w:color w:val="14213D"/>
-          <w:sz w:val="18"/>
+          <w:sz w:val="17"/>
         </w:rPr>
-        <w:t>Pioneered in-product onboarding, education, help-center content, and telemetry with Pendo; partnered cross-functionally on employee development programs.</w:t>
+        <w:t>EARLIER</w:t>
+      </w:r>
+      <w:r>
+        <w:rPr>
+          <w:rFonts w:ascii="Arial" w:hAnsi="Arial"/>
+          <w:color w:val="5C6878"/>
+          <w:sz w:val="17"/>
+        </w:rPr>
+        <w:t xml:space="preserve"> | MarketShare - Data Strategy | Data Meaning - Technical Lead | MicroStrategy - Education + Support</w:t>
       </w:r>
     </w:p>
     <w:p>
       <w:pPr>
         <w:pStyle w:val="Heading1"/>
         <w:pBdr>
-          <w:bottom w:val="single" w:sz="6" w:space="2" w:color="DFE4DC"/>
+          <w:bottom w:val="single" w:sz="6" w:space="1" w:color="DFE4DC"/>
         </w:pBdr>
       </w:pPr>
       <w:r>
@@ -802,48 +656,82 @@
           <w:rFonts w:ascii="Arial" w:hAnsi="Arial"/>
           <w:b/>
           <w:color w:val="335CFF"/>
-          <w:sz w:val="20"/>
+          <w:sz w:val="19"/>
         </w:rPr>
-        <w:t>ADDITIONAL EXPERIENCE</w:t>
+        <w:t>SELECTED AI BUILDS</w:t>
       </w:r>
     </w:p>
     <w:p>
       <w:pPr>
-        <w:pStyle w:val="CompactLine"/>
+        <w:pStyle w:val="ImpactLineOnePage"/>
       </w:pPr>
       <w:r>
         <w:rPr>
+          <w:rFonts w:ascii="Arial" w:hAnsi="Arial"/>
           <w:b/>
+          <w:color w:val="335CFF"/>
+          <w:sz w:val="18"/>
         </w:rPr>
-        <w:t>MarketShare</w:t>
-      </w:r>
-      <w:r>
-        <w:t xml:space="preserve"> - Manager, Data Strategy  |  </w:t>
+        <w:t xml:space="preserve">CERTIFYFAST  </w:t>
       </w:r>
       <w:r>
         <w:rPr>
+          <w:rFonts w:ascii="Arial" w:hAnsi="Arial"/>
+          <w:color w:val="14213D"/>
+          <w:sz w:val="18"/>
+        </w:rPr>
+        <w:t>Source-grounded certification workflow with traceability for expert review.</w:t>
+      </w:r>
+    </w:p>
+    <w:p>
+      <w:pPr>
+        <w:pStyle w:val="ImpactLineOnePage"/>
+      </w:pPr>
+      <w:r>
+        <w:rPr>
+          <w:rFonts w:ascii="Arial" w:hAnsi="Arial"/>
           <w:b/>
+          <w:color w:val="335CFF"/>
+          <w:sz w:val="18"/>
         </w:rPr>
-        <w:t>Data Meaning</w:t>
-      </w:r>
-      <w:r>
-        <w:t xml:space="preserve"> - Technical Lead  |  </w:t>
+        <w:t xml:space="preserve">BLOOM  </w:t>
       </w:r>
       <w:r>
         <w:rPr>
+          <w:rFonts w:ascii="Arial" w:hAnsi="Arial"/>
+          <w:color w:val="14213D"/>
+          <w:sz w:val="18"/>
+        </w:rPr>
+        <w:t>Turned a 1,000+ use signal into an assessment workflow with source evidence and teacher checkpoints.</w:t>
+      </w:r>
+    </w:p>
+    <w:p>
+      <w:pPr>
+        <w:pStyle w:val="ImpactLineOnePage"/>
+      </w:pPr>
+      <w:r>
+        <w:rPr>
+          <w:rFonts w:ascii="Arial" w:hAnsi="Arial"/>
           <w:b/>
+          <w:color w:val="335CFF"/>
+          <w:sz w:val="18"/>
         </w:rPr>
-        <w:t>MicroStrategy</w:t>
+        <w:t xml:space="preserve">RETRIEVAL GUARD  </w:t>
       </w:r>
       <w:r>
-        <w:t xml:space="preserve"> - Education Consultant; Technical Support Engineer</w:t>
+        <w:rPr>
+          <w:rFonts w:ascii="Arial" w:hAnsi="Arial"/>
+          <w:color w:val="14213D"/>
+          <w:sz w:val="18"/>
+        </w:rPr>
+        <w:t>Experimental Python toolkit for retrieval regression testing and near-miss filtering.</w:t>
       </w:r>
     </w:p>
     <w:p>
       <w:pPr>
         <w:pStyle w:val="Heading1"/>
         <w:pBdr>
-          <w:bottom w:val="single" w:sz="6" w:space="2" w:color="DFE4DC"/>
+          <w:bottom w:val="single" w:sz="6" w:space="1" w:color="DFE4DC"/>
         </w:pBdr>
       </w:pPr>
       <w:r>
@@ -851,121 +739,61 @@
           <w:rFonts w:ascii="Arial" w:hAnsi="Arial"/>
           <w:b/>
           <w:color w:val="335CFF"/>
-          <w:sz w:val="20"/>
+          <w:sz w:val="19"/>
         </w:rPr>
-        <w:t>SELECTED AI BUILDS</w:t>
+        <w:t>EDUCATION &amp; SERVICE</w:t>
       </w:r>
     </w:p>
     <w:p>
       <w:pPr>
-        <w:pStyle w:val="ResumeBullet"/>
-        <w:numPr>
-          <w:ilvl w:val="0"/>
-          <w:numId w:val="10"/>
-        </w:numPr>
+        <w:pStyle w:val="ImpactLineOnePage"/>
       </w:pPr>
+      <w:r>
+        <w:rPr>
+          <w:rFonts w:ascii="Arial" w:hAnsi="Arial"/>
+          <w:b/>
+          <w:color w:val="335CFF"/>
+          <w:sz w:val="18"/>
+        </w:rPr>
+        <w:t xml:space="preserve">CORNELL  </w:t>
+      </w:r>
       <w:r>
         <w:rPr>
           <w:rFonts w:ascii="Arial" w:hAnsi="Arial"/>
           <w:color w:val="14213D"/>
           <w:sz w:val="18"/>
         </w:rPr>
-        <w:t>CertifyFast - Product concept for turning authoritative source material into traceable job-task analysis and exam-development artifacts for expert review.</w:t>
+        <w:t>School of Engineering - Information Science, Systems and Technology</w:t>
       </w:r>
     </w:p>
     <w:p>
       <w:pPr>
-        <w:pStyle w:val="ResumeBullet"/>
-        <w:numPr>
-          <w:ilvl w:val="0"/>
-          <w:numId w:val="10"/>
-        </w:numPr>
+        <w:pStyle w:val="ImpactLineOnePage"/>
       </w:pPr>
+      <w:r>
+        <w:rPr>
+          <w:rFonts w:ascii="Arial" w:hAnsi="Arial"/>
+          <w:b/>
+          <w:color w:val="335CFF"/>
+          <w:sz w:val="18"/>
+        </w:rPr>
+        <w:t xml:space="preserve">BECKET YMCA  </w:t>
+      </w:r>
       <w:r>
         <w:rPr>
           <w:rFonts w:ascii="Arial" w:hAnsi="Arial"/>
           <w:color w:val="14213D"/>
           <w:sz w:val="18"/>
         </w:rPr>
-        <w:t>BloomGPT and Bloom Quiz Builder - Turned a 1,000+ use signal into a source-grounded assessment workflow with teacher checkpoints and structured output.</w:t>
-      </w:r>
-    </w:p>
-    <w:p>
-      <w:pPr>
-        <w:pStyle w:val="ResumeBullet"/>
-        <w:numPr>
-          <w:ilvl w:val="0"/>
-          <w:numId w:val="10"/>
-        </w:numPr>
-      </w:pPr>
-      <w:r>
-        <w:rPr>
-          <w:rFonts w:ascii="Arial" w:hAnsi="Arial"/>
-          <w:color w:val="14213D"/>
-          <w:sz w:val="18"/>
-        </w:rPr>
-        <w:t>Retrieval Guard - Experimental Python toolkit for retrieval regression testing and structurally similar near-miss filtering before context reaches an LLM or agent.</w:t>
-      </w:r>
-    </w:p>
-    <w:p>
-      <w:pPr>
-        <w:pStyle w:val="Heading1"/>
-        <w:pBdr>
-          <w:bottom w:val="single" w:sz="6" w:space="2" w:color="DFE4DC"/>
-        </w:pBdr>
-      </w:pPr>
-      <w:r>
-        <w:rPr>
-          <w:rFonts w:ascii="Arial" w:hAnsi="Arial"/>
-          <w:b/>
-          <w:color w:val="335CFF"/>
-          <w:sz w:val="20"/>
-        </w:rPr>
-        <w:t>EDUCATION &amp; SERVICE</w:t>
-      </w:r>
-    </w:p>
-    <w:p>
-      <w:pPr>
-        <w:pStyle w:val="CompactLine"/>
-      </w:pPr>
-      <w:r>
-        <w:rPr>
-          <w:rFonts w:ascii="Arial" w:hAnsi="Arial"/>
-          <w:b/>
-          <w:color w:val="14213D"/>
-          <w:sz w:val="18"/>
-        </w:rPr>
-        <w:t>Cornell University, School of Engineering</w:t>
-      </w:r>
-      <w:r>
-        <w:t xml:space="preserve"> - Information Science, Systems and Technology</w:t>
-      </w:r>
-    </w:p>
-    <w:p>
-      <w:pPr>
-        <w:pStyle w:val="CompactLine"/>
-      </w:pPr>
-      <w:r>
-        <w:rPr>
-          <w:rFonts w:ascii="Arial" w:hAnsi="Arial"/>
-          <w:b/>
-          <w:color w:val="14213D"/>
-          <w:sz w:val="18"/>
-        </w:rPr>
-        <w:t>Becket Chimney Corners YMCA</w:t>
-      </w:r>
-      <w:r>
-        <w:t xml:space="preserve"> - Alumni Council / Ambassador, January 2017 - Present</w:t>
+        <w:t>Alumni Council / Ambassador, Jan 2017 - Present</w:t>
       </w:r>
     </w:p>
     <w:sectPr>
-      <w:headerReference w:type="first" r:id="rId9"/>
-      <w:headerReference w:type="default" r:id="rId10"/>
-      <w:footerReference w:type="default" r:id="rId11"/>
+      <w:headerReference w:type="default" r:id="rId9"/>
+      <w:footerReference w:type="default" r:id="rId10"/>
       <w:pgSz w:w="12240" w:h="15840"/>
-      <w:pgMar w:top="893" w:right="1008" w:bottom="893" w:left="1008" w:header="403" w:footer="403" w:gutter="0"/>
+      <w:pgMar w:top="605" w:right="662" w:bottom="576" w:left="662" w:header="288" w:footer="288" w:gutter="0"/>
       <w:cols w:space="720"/>
-      <w:titlePg/>
       <w:docGrid w:linePitch="360"/>
     </w:sectPr>
   </w:body>
@@ -977,49 +805,8 @@
   <w:p>
     <w:pPr>
       <w:pStyle w:val="Footer"/>
-      <w:spacing w:before="0"/>
-      <w:jc w:val="right"/>
-    </w:pPr>
-    <w:r>
-      <w:rPr>
-        <w:rFonts w:ascii="Arial" w:hAnsi="Arial"/>
-        <w:color w:val="5C6878"/>
-        <w:sz w:val="16"/>
-      </w:rPr>
-      <w:t xml:space="preserve">Page </w:t>
-    </w:r>
-    <w:r>
-      <w:rPr>
-        <w:rFonts w:ascii="Arial" w:hAnsi="Arial"/>
-        <w:color w:val="5C6878"/>
-        <w:sz w:val="16"/>
-      </w:rPr>
-      <w:fldChar w:fldCharType="begin"/>
-      <w:instrText xml:space="preserve"> PAGE </w:instrText>
-      <w:fldChar w:fldCharType="separate"/>
-      <w:t>1</w:t>
-      <w:fldChar w:fldCharType="end"/>
-    </w:r>
-    <w:r>
-      <w:rPr>
-        <w:rFonts w:ascii="Arial" w:hAnsi="Arial"/>
-        <w:color w:val="5C6878"/>
-        <w:sz w:val="16"/>
-      </w:rPr>
-      <w:t xml:space="preserve"> of </w:t>
-    </w:r>
-    <w:r>
-      <w:rPr>
-        <w:rFonts w:ascii="Arial" w:hAnsi="Arial"/>
-        <w:color w:val="5C6878"/>
-        <w:sz w:val="16"/>
-      </w:rPr>
-      <w:fldChar w:fldCharType="begin"/>
-      <w:instrText xml:space="preserve"> NUMPAGES </w:instrText>
-      <w:fldChar w:fldCharType="separate"/>
-      <w:t>1</w:t>
-      <w:fldChar w:fldCharType="end"/>
-    </w:r>
+    </w:pPr>
+    <w:r/>
   </w:p>
 </w:ftr>
 </file>
@@ -1031,34 +818,6 @@
       <w:pStyle w:val="Header"/>
     </w:pPr>
     <w:r/>
-  </w:p>
-</w:hdr>
-</file>
-
-<file path=word/header2.xml><?xml version="1.0" encoding="utf-8"?>
-<w:hdr xmlns:m="http://schemas.openxmlformats.org/officeDocument/2006/math" xmlns:mc="http://schemas.openxmlformats.org/markup-compatibility/2006" xmlns:mo="http://schemas.microsoft.com/office/mac/office/2008/main" xmlns:mv="urn:schemas-microsoft-com:mac:vml" xmlns:o="urn:schemas-microsoft-com:office:office" xmlns:r="http://schemas.openxmlformats.org/officeDocument/2006/relationships" xmlns:v="urn:schemas-microsoft-com:vml" xmlns:w10="urn:schemas-microsoft-com:office:word" xmlns:w14="http://schemas.microsoft.com/office/word/2010/wordml" xmlns:w="http://schemas.openxmlformats.org/wordprocessingml/2006/main" xmlns:wne="http://schemas.microsoft.com/office/word/2006/wordml" xmlns:wp14="http://schemas.microsoft.com/office/word/2010/wordprocessingDrawing" xmlns:wp="http://schemas.openxmlformats.org/drawingml/2006/wordprocessingDrawing" xmlns:wpc="http://schemas.microsoft.com/office/word/2010/wordprocessingCanvas" xmlns:wpg="http://schemas.microsoft.com/office/word/2010/wordprocessingGroup" xmlns:wpi="http://schemas.microsoft.com/office/word/2010/wordprocessingInk" xmlns:wps="http://schemas.microsoft.com/office/word/2010/wordprocessingShape" mc:Ignorable="w14 wp14">
-  <w:p>
-    <w:pPr>
-      <w:pStyle w:val="Header"/>
-      <w:spacing w:after="0"/>
-    </w:pPr>
-    <w:r>
-      <w:rPr>
-        <w:rFonts w:ascii="Arial" w:hAnsi="Arial"/>
-        <w:b/>
-        <w:color w:val="14213D"/>
-        <w:sz w:val="16"/>
-      </w:rPr>
-      <w:t>ALEXANDER AIDUN</w:t>
-    </w:r>
-    <w:r>
-      <w:rPr>
-        <w:rFonts w:ascii="Arial" w:hAnsi="Arial"/>
-        <w:color w:val="5C6878"/>
-        <w:sz w:val="15"/>
-      </w:rPr>
-      <w:t xml:space="preserve">  |  ENTERPRISE AI PRODUCT, OPERATIONS &amp; ADOPTION LEADER</w:t>
-    </w:r>
   </w:p>
 </w:hdr>
 </file>
@@ -1262,28 +1021,6 @@
   </w:num>
   <w:num w:numId="9">
     <w:abstractNumId w:val="0"/>
-  </w:num>
-  <w:abstractNum w:abstractNumId="9">
-    <w:multiLevelType w:val="singleLevel"/>
-    <w:lvl w:ilvl="0">
-      <w:start w:val="1"/>
-      <w:numFmt w:val="bullet"/>
-      <w:lvlText w:val="•"/>
-      <w:lvlJc w:val="left"/>
-      <w:pPr>
-        <w:tabs>
-          <w:tab w:val="num" w:pos="547"/>
-        </w:tabs>
-        <w:ind w:left="547" w:hanging="288"/>
-      </w:pPr>
-      <w:rPr>
-        <w:color w:val="335CFF"/>
-        <w:sz w:val="16"/>
-      </w:rPr>
-    </w:lvl>
-  </w:abstractNum>
-  <w:num w:numId="10">
-    <w:abstractNumId w:val="9"/>
   </w:num>
 </w:numbering>
 </file>
@@ -1449,7 +1186,8 @@
     <w:qFormat/>
     <w:rsid w:val="00FC693F"/>
     <w:pPr>
-      <w:spacing w:before="0" w:after="0" w:line="252" w:lineRule="auto"/>
+      <w:keepLines/>
+      <w:spacing w:before="0" w:after="0" w:line="240" w:lineRule="auto"/>
     </w:pPr>
     <w:rPr>
       <w:rFonts w:ascii="Arial" w:hAnsi="Arial"/>
@@ -1512,7 +1250,7 @@
     <w:pPr>
       <w:keepNext/>
       <w:keepLines/>
-      <w:spacing w:before="140" w:after="70"/>
+      <w:spacing w:before="120" w:after="60" w:line="240" w:lineRule="auto"/>
       <w:outlineLvl w:val="0"/>
     </w:pPr>
     <w:rPr>
@@ -1520,7 +1258,7 @@
       <w:b/>
       <w:bCs/>
       <w:color w:val="335CFF"/>
-      <w:sz w:val="20"/>
+      <w:sz w:val="19"/>
       <w:szCs w:val="28"/>
     </w:rPr>
   </w:style>
@@ -13139,96 +12877,75 @@
       </w:tcPr>
     </w:tblStylePr>
   </w:style>
-  <w:style w:type="paragraph" w:customStyle="1" w:styleId="ResumeName">
-    <w:name w:val="Resume Name"/>
-    <w:pPr>
-      <w:spacing w:after="20"/>
+  <w:style w:type="paragraph" w:customStyle="1" w:styleId="ResumeNameOnePage">
+    <w:name w:val="Resume Name One Page"/>
+    <w:pPr>
+      <w:spacing w:after="20" w:line="240" w:lineRule="auto"/>
     </w:pPr>
     <w:rPr>
       <w:rFonts w:ascii="Arial" w:hAnsi="Arial"/>
       <w:b/>
       <w:color w:val="14213D"/>
-      <w:sz w:val="52"/>
+      <w:sz w:val="48"/>
     </w:rPr>
   </w:style>
-  <w:style w:type="paragraph" w:customStyle="1" w:styleId="ResumeTitle">
-    <w:name w:val="Resume Title"/>
-    <w:pPr>
-      <w:spacing w:after="80"/>
+  <w:style w:type="paragraph" w:customStyle="1" w:styleId="ResumeTitleOnePage">
+    <w:name w:val="Resume Title One Page"/>
+    <w:pPr>
+      <w:spacing w:after="60" w:line="240" w:lineRule="auto"/>
     </w:pPr>
     <w:rPr>
       <w:rFonts w:ascii="Arial" w:hAnsi="Arial"/>
       <w:b/>
       <w:color w:val="335CFF"/>
-      <w:sz w:val="25"/>
+      <w:sz w:val="22"/>
     </w:rPr>
   </w:style>
-  <w:style w:type="paragraph" w:customStyle="1" w:styleId="ResumeContact">
-    <w:name w:val="Resume Contact"/>
-    <w:pPr>
-      <w:spacing w:after="140"/>
+  <w:style w:type="paragraph" w:customStyle="1" w:styleId="ResumeContactOnePage">
+    <w:name w:val="Resume Contact One Page"/>
+    <w:pPr>
+      <w:spacing w:after="100" w:line="240" w:lineRule="auto"/>
     </w:pPr>
     <w:rPr>
       <w:rFonts w:ascii="Arial" w:hAnsi="Arial"/>
       <w:color w:val="5C6878"/>
-      <w:sz w:val="18"/>
+      <w:sz w:val="16"/>
     </w:rPr>
   </w:style>
-  <w:style w:type="paragraph" w:customStyle="1" w:styleId="ExecutiveProfile">
-    <w:name w:val="Executive Profile"/>
-    <w:pPr>
-      <w:spacing w:line="269" w:lineRule="auto" w:after="20"/>
+  <w:style w:type="paragraph" w:customStyle="1" w:styleId="CoreLineOnePage">
+    <w:name w:val="Core Line One Page"/>
+    <w:pPr>
+      <w:keepLines/>
+      <w:spacing w:after="80" w:line="240" w:lineRule="auto"/>
     </w:pPr>
     <w:rPr>
       <w:rFonts w:ascii="Arial" w:hAnsi="Arial"/>
       <w:color w:val="14213D"/>
-      <w:sz w:val="20"/>
+      <w:sz w:val="17"/>
     </w:rPr>
   </w:style>
-  <w:style w:type="paragraph" w:customStyle="1" w:styleId="CompactLine">
-    <w:name w:val="Compact Line"/>
-    <w:pPr>
-      <w:spacing w:line="252" w:lineRule="auto" w:after="20"/>
+  <w:style w:type="paragraph" w:customStyle="1" w:styleId="JobHeaderOnePage">
+    <w:name w:val="Job Header One Page"/>
+    <w:pPr>
+      <w:keepNext/>
+      <w:keepLines/>
+      <w:tabs>
+        <w:tab w:pos="10915" w:val="right"/>
+      </w:tabs>
+      <w:spacing w:before="90" w:after="24" w:line="240" w:lineRule="auto"/>
     </w:pPr>
     <w:rPr>
       <w:rFonts w:ascii="Arial" w:hAnsi="Arial"/>
       <w:color w:val="14213D"/>
-      <w:sz w:val="18"/>
+      <w:sz w:val="17"/>
     </w:rPr>
   </w:style>
-  <w:style w:type="paragraph" w:customStyle="1" w:styleId="JobHeader">
-    <w:name w:val="Job Header"/>
-    <w:pPr>
-      <w:keepNext/>
-      <w:tabs>
-        <w:tab w:pos="10224" w:val="right"/>
-      </w:tabs>
-      <w:spacing w:before="90" w:after="0"/>
-    </w:pPr>
-    <w:rPr>
-      <w:rFonts w:ascii="Arial" w:hAnsi="Arial"/>
-      <w:color w:val="14213D"/>
-      <w:sz w:val="19"/>
-    </w:rPr>
-  </w:style>
-  <w:style w:type="paragraph" w:customStyle="1" w:styleId="RoleLine">
-    <w:name w:val="Role Line"/>
-    <w:pPr>
-      <w:keepNext/>
-      <w:spacing w:after="30"/>
-    </w:pPr>
-    <w:rPr>
-      <w:rFonts w:ascii="Arial" w:hAnsi="Arial"/>
-      <w:i/>
-      <w:color w:val="5C6878"/>
-      <w:sz w:val="18"/>
-    </w:rPr>
-  </w:style>
-  <w:style w:type="paragraph" w:customStyle="1" w:styleId="ResumeBullet">
-    <w:name w:val="Resume Bullet"/>
+  <w:style w:type="paragraph" w:customStyle="1" w:styleId="ImpactLineOnePage">
+    <w:name w:val="Impact Line One Page"/>
     <w:pPr>
       <w:keepLines/>
-      <w:spacing w:before="0" w:after="42" w:lineRule="auto" w:line="252"/>
+      <w:spacing w:before="0" w:after="42" w:line="240" w:lineRule="auto"/>
+      <w:ind w:left="0" w:firstLine="0"/>
     </w:pPr>
     <w:rPr>
       <w:rFonts w:ascii="Arial" w:hAnsi="Arial"/>

</xml_diff>